<commit_message>
Attendee material regenerated (13 Oct): deck after the formatting and fact pass (repo and follow-along URLs on slide 6, Start VM on Connect on Azure Local, autoscale not documented; Pattern B as a design), handouts and follow-along guide as PDF, Word and Markdown, follow-along site source; README: Packer for Hyper-V validated, not built
</commit_message>
<xml_diff>
--- a/handouts/Deployment_Checklist.docx
+++ b/handouts/Deployment_Checklist.docx
@@ -2009,7 +2009,6 @@
           <w:szCs w:val="21"/>
           <w:lang w:val="en"/>
         </w:rPr>
-        <w:lastRenderedPageBreak/>
         <w:t>ACLs are applied.</w:t>
       </w:r>
     </w:p>
@@ -2256,7 +2255,7 @@
           <w:szCs w:val="21"/>
           <w:lang w:val="en"/>
         </w:rPr>
-        <w:t>Start VM on Connect is an Azure option.</w:t>
+        <w:t>Start VM on Connect works for session hosts on Azure and on Azure Local, in personal and pooled host pools; it needs the Desktop Virtualization Power On Contributor role. It is not available for AVD Hybrid.</w:t>
       </w:r>
     </w:p>
     <w:p>
@@ -2590,7 +2589,6 @@
           <w:rFonts w:ascii="Segoe UI" w:eastAsia="Times New Roman" w:hAnsi="Segoe UI" w:cs="Segoe UI"/>
           <w:lang w:val="en"/>
         </w:rPr>
-        <w:lastRenderedPageBreak/>
         <w:t>Day 1 and Day 2</w:t>
       </w:r>
     </w:p>
@@ -3474,9 +3472,9 @@
 <file path=word/numbering.xml><?xml version="1.0" encoding="utf-8"?>
 <w:numbering xmlns:wpc="http://schemas.microsoft.com/office/word/2010/wordprocessingCanvas" xmlns:cx="http://schemas.microsoft.com/office/drawing/2014/chartex" xmlns:cx1="http://schemas.microsoft.com/office/drawing/2015/9/8/chartex" xmlns:cx2="http://schemas.microsoft.com/office/drawing/2015/10/21/chartex" xmlns:cx3="http://schemas.microsoft.com/office/drawing/2016/5/9/chartex" xmlns:cx4="http://schemas.microsoft.com/office/drawing/2016/5/10/chartex" xmlns:cx5="http://schemas.microsoft.com/office/drawing/2016/5/11/chartex" xmlns:cx6="http://schemas.microsoft.com/office/drawing/2016/5/12/chartex" xmlns:cx7="http://schemas.microsoft.com/office/drawing/2016/5/13/chartex" xmlns:cx8="http://schemas.microsoft.com/office/drawing/2016/5/14/chartex" xmlns:mc="http://schemas.openxmlformats.org/markup-compatibility/2006" xmlns:aink="http://schemas.microsoft.com/office/drawing/2016/ink" xmlns:am3d="http://schemas.microsoft.com/office/drawing/2017/model3d" xmlns:o="urn:schemas-microsoft-com:office:office" xmlns:oel="http://schemas.microsoft.com/office/2019/extlst" xmlns:r="http://schemas.openxmlformats.org/officeDocument/2006/relationships" xmlns:m="http://schemas.openxmlformats.org/officeDocument/2006/math" xmlns:v="urn:schemas-microsoft-com:vml" xmlns:wp14="http://schemas.microsoft.com/office/word/2010/wordprocessingDrawing" xmlns:wp="http://schemas.openxmlformats.org/drawingml/2006/wordprocessingDrawing" xmlns:w10="urn:schemas-microsoft-com:office:word" xmlns:w="http://schemas.openxmlformats.org/wordprocessingml/2006/main" xmlns:w14="http://schemas.microsoft.com/office/word/2010/wordml" xmlns:w15="http://schemas.microsoft.com/office/word/2012/wordml" xmlns:w16cex="http://schemas.microsoft.com/office/word/2018/wordml/cex" xmlns:w16cid="http://schemas.microsoft.com/office/word/2016/wordml/cid" xmlns:w16="http://schemas.microsoft.com/office/word/2018/wordml" xmlns:w16du="http://schemas.microsoft.com/office/word/2023/wordml/word16du" xmlns:w16sdtdh="http://schemas.microsoft.com/office/word/2020/wordml/sdtdatahash" xmlns:w16sdtfl="http://schemas.microsoft.com/office/word/2024/wordml/sdtformatlock" xmlns:w16se="http://schemas.microsoft.com/office/word/2015/wordml/symex" xmlns:wpg="http://schemas.microsoft.com/office/word/2010/wordprocessingGroup" xmlns:wpi="http://schemas.microsoft.com/office/word/2010/wordprocessingInk" xmlns:wne="http://schemas.microsoft.com/office/word/2006/wordml" xmlns:wps="http://schemas.microsoft.com/office/word/2010/wordprocessingShape" mc:Ignorable="w14 w15 w16se w16cid w16 w16cex w16sdtdh w16sdtfl w16du wp14">
   <w:abstractNum w:abstractNumId="0" w15:restartNumberingAfterBreak="0">
-    <w:nsid w:val="0CC632AD"/>
+    <w:nsid w:val="039179D7"/>
     <w:multiLevelType w:val="multilevel"/>
-    <w:tmpl w:val="A4E6B2BE"/>
+    <w:tmpl w:val="1A3E3CF2"/>
     <w:lvl w:ilvl="0">
       <w:start w:val="1"/>
       <w:numFmt w:val="bullet"/>
@@ -3623,9 +3621,9 @@
     </w:lvl>
   </w:abstractNum>
   <w:abstractNum w:abstractNumId="1" w15:restartNumberingAfterBreak="0">
-    <w:nsid w:val="0DB229D7"/>
+    <w:nsid w:val="06C1535D"/>
     <w:multiLevelType w:val="multilevel"/>
-    <w:tmpl w:val="9E1E9230"/>
+    <w:tmpl w:val="CA4C6F80"/>
     <w:lvl w:ilvl="0">
       <w:start w:val="1"/>
       <w:numFmt w:val="bullet"/>
@@ -3772,9 +3770,9 @@
     </w:lvl>
   </w:abstractNum>
   <w:abstractNum w:abstractNumId="2" w15:restartNumberingAfterBreak="0">
-    <w:nsid w:val="0DB346DC"/>
+    <w:nsid w:val="2884795E"/>
     <w:multiLevelType w:val="multilevel"/>
-    <w:tmpl w:val="6B8EC92C"/>
+    <w:tmpl w:val="BA5E239E"/>
     <w:lvl w:ilvl="0">
       <w:start w:val="1"/>
       <w:numFmt w:val="bullet"/>
@@ -3921,9 +3919,9 @@
     </w:lvl>
   </w:abstractNum>
   <w:abstractNum w:abstractNumId="3" w15:restartNumberingAfterBreak="0">
-    <w:nsid w:val="10EF4733"/>
+    <w:nsid w:val="2DA30C7C"/>
     <w:multiLevelType w:val="multilevel"/>
-    <w:tmpl w:val="74C66E2C"/>
+    <w:tmpl w:val="5C78D0B0"/>
     <w:lvl w:ilvl="0">
       <w:start w:val="1"/>
       <w:numFmt w:val="bullet"/>
@@ -4070,9 +4068,9 @@
     </w:lvl>
   </w:abstractNum>
   <w:abstractNum w:abstractNumId="4" w15:restartNumberingAfterBreak="0">
-    <w:nsid w:val="1AA3035C"/>
+    <w:nsid w:val="2FD53B7B"/>
     <w:multiLevelType w:val="multilevel"/>
-    <w:tmpl w:val="18BE7930"/>
+    <w:tmpl w:val="5C708DB8"/>
     <w:lvl w:ilvl="0">
       <w:start w:val="1"/>
       <w:numFmt w:val="bullet"/>
@@ -4219,9 +4217,9 @@
     </w:lvl>
   </w:abstractNum>
   <w:abstractNum w:abstractNumId="5" w15:restartNumberingAfterBreak="0">
-    <w:nsid w:val="1C117239"/>
+    <w:nsid w:val="30D10953"/>
     <w:multiLevelType w:val="multilevel"/>
-    <w:tmpl w:val="917A66FA"/>
+    <w:tmpl w:val="EF541B54"/>
     <w:lvl w:ilvl="0">
       <w:start w:val="1"/>
       <w:numFmt w:val="bullet"/>
@@ -4368,9 +4366,9 @@
     </w:lvl>
   </w:abstractNum>
   <w:abstractNum w:abstractNumId="6" w15:restartNumberingAfterBreak="0">
-    <w:nsid w:val="23ED798B"/>
+    <w:nsid w:val="3F112543"/>
     <w:multiLevelType w:val="multilevel"/>
-    <w:tmpl w:val="34ECC9D0"/>
+    <w:tmpl w:val="807CA0C8"/>
     <w:lvl w:ilvl="0">
       <w:start w:val="1"/>
       <w:numFmt w:val="bullet"/>
@@ -4517,9 +4515,9 @@
     </w:lvl>
   </w:abstractNum>
   <w:abstractNum w:abstractNumId="7" w15:restartNumberingAfterBreak="0">
-    <w:nsid w:val="25FB4978"/>
+    <w:nsid w:val="42E050D2"/>
     <w:multiLevelType w:val="multilevel"/>
-    <w:tmpl w:val="740459D8"/>
+    <w:tmpl w:val="B888B858"/>
     <w:lvl w:ilvl="0">
       <w:start w:val="1"/>
       <w:numFmt w:val="bullet"/>
@@ -4666,9 +4664,9 @@
     </w:lvl>
   </w:abstractNum>
   <w:abstractNum w:abstractNumId="8" w15:restartNumberingAfterBreak="0">
-    <w:nsid w:val="46F267A8"/>
+    <w:nsid w:val="43322774"/>
     <w:multiLevelType w:val="multilevel"/>
-    <w:tmpl w:val="DE2CF582"/>
+    <w:tmpl w:val="929AB992"/>
     <w:lvl w:ilvl="0">
       <w:start w:val="1"/>
       <w:numFmt w:val="bullet"/>
@@ -4815,9 +4813,9 @@
     </w:lvl>
   </w:abstractNum>
   <w:abstractNum w:abstractNumId="9" w15:restartNumberingAfterBreak="0">
-    <w:nsid w:val="506B5A70"/>
+    <w:nsid w:val="440D6471"/>
     <w:multiLevelType w:val="multilevel"/>
-    <w:tmpl w:val="A6905442"/>
+    <w:tmpl w:val="195C65BE"/>
     <w:lvl w:ilvl="0">
       <w:start w:val="1"/>
       <w:numFmt w:val="bullet"/>
@@ -4964,9 +4962,9 @@
     </w:lvl>
   </w:abstractNum>
   <w:abstractNum w:abstractNumId="10" w15:restartNumberingAfterBreak="0">
-    <w:nsid w:val="5C7968A3"/>
+    <w:nsid w:val="46474FAF"/>
     <w:multiLevelType w:val="multilevel"/>
-    <w:tmpl w:val="F8686254"/>
+    <w:tmpl w:val="6CD83888"/>
     <w:lvl w:ilvl="0">
       <w:start w:val="1"/>
       <w:numFmt w:val="bullet"/>
@@ -5113,9 +5111,9 @@
     </w:lvl>
   </w:abstractNum>
   <w:abstractNum w:abstractNumId="11" w15:restartNumberingAfterBreak="0">
-    <w:nsid w:val="5F8C3CB1"/>
+    <w:nsid w:val="531B0812"/>
     <w:multiLevelType w:val="multilevel"/>
-    <w:tmpl w:val="481E22C4"/>
+    <w:tmpl w:val="B5D8CAA2"/>
     <w:lvl w:ilvl="0">
       <w:start w:val="1"/>
       <w:numFmt w:val="bullet"/>
@@ -5262,9 +5260,9 @@
     </w:lvl>
   </w:abstractNum>
   <w:abstractNum w:abstractNumId="12" w15:restartNumberingAfterBreak="0">
-    <w:nsid w:val="6481627B"/>
+    <w:nsid w:val="58770E20"/>
     <w:multiLevelType w:val="multilevel"/>
-    <w:tmpl w:val="97C62D88"/>
+    <w:tmpl w:val="420C5570"/>
     <w:lvl w:ilvl="0">
       <w:start w:val="1"/>
       <w:numFmt w:val="bullet"/>
@@ -5411,9 +5409,9 @@
     </w:lvl>
   </w:abstractNum>
   <w:abstractNum w:abstractNumId="13" w15:restartNumberingAfterBreak="0">
-    <w:nsid w:val="65930256"/>
+    <w:nsid w:val="5893410A"/>
     <w:multiLevelType w:val="multilevel"/>
-    <w:tmpl w:val="970E6B86"/>
+    <w:tmpl w:val="D4EACD44"/>
     <w:lvl w:ilvl="0">
       <w:start w:val="1"/>
       <w:numFmt w:val="bullet"/>
@@ -5560,9 +5558,9 @@
     </w:lvl>
   </w:abstractNum>
   <w:abstractNum w:abstractNumId="14" w15:restartNumberingAfterBreak="0">
-    <w:nsid w:val="696D4BF3"/>
+    <w:nsid w:val="6193169F"/>
     <w:multiLevelType w:val="multilevel"/>
-    <w:tmpl w:val="F672FC86"/>
+    <w:tmpl w:val="284AE71E"/>
     <w:lvl w:ilvl="0">
       <w:start w:val="1"/>
       <w:numFmt w:val="bullet"/>
@@ -5709,9 +5707,9 @@
     </w:lvl>
   </w:abstractNum>
   <w:abstractNum w:abstractNumId="15" w15:restartNumberingAfterBreak="0">
-    <w:nsid w:val="6C6E00C3"/>
+    <w:nsid w:val="625C3F10"/>
     <w:multiLevelType w:val="multilevel"/>
-    <w:tmpl w:val="DCBCA9B0"/>
+    <w:tmpl w:val="ED881E32"/>
     <w:lvl w:ilvl="0">
       <w:start w:val="1"/>
       <w:numFmt w:val="bullet"/>
@@ -5858,9 +5856,9 @@
     </w:lvl>
   </w:abstractNum>
   <w:abstractNum w:abstractNumId="16" w15:restartNumberingAfterBreak="0">
-    <w:nsid w:val="6E521E66"/>
+    <w:nsid w:val="76A61C4A"/>
     <w:multiLevelType w:val="multilevel"/>
-    <w:tmpl w:val="C434B6FA"/>
+    <w:tmpl w:val="133087F6"/>
     <w:lvl w:ilvl="0">
       <w:start w:val="1"/>
       <w:numFmt w:val="bullet"/>
@@ -6006,56 +6004,56 @@
       </w:rPr>
     </w:lvl>
   </w:abstractNum>
-  <w:num w:numId="1" w16cid:durableId="401373540">
+  <w:num w:numId="1" w16cid:durableId="924147049">
+    <w:abstractNumId w:val="16"/>
+  </w:num>
+  <w:num w:numId="2" w16cid:durableId="357126352">
     <w:abstractNumId w:val="12"/>
   </w:num>
-  <w:num w:numId="2" w16cid:durableId="514733740">
+  <w:num w:numId="3" w16cid:durableId="250898049">
+    <w:abstractNumId w:val="1"/>
+  </w:num>
+  <w:num w:numId="4" w16cid:durableId="1353797635">
+    <w:abstractNumId w:val="7"/>
+  </w:num>
+  <w:num w:numId="5" w16cid:durableId="457839182">
+    <w:abstractNumId w:val="11"/>
+  </w:num>
+  <w:num w:numId="6" w16cid:durableId="1926528823">
+    <w:abstractNumId w:val="14"/>
+  </w:num>
+  <w:num w:numId="7" w16cid:durableId="1302688921">
+    <w:abstractNumId w:val="6"/>
+  </w:num>
+  <w:num w:numId="8" w16cid:durableId="1731031829">
+    <w:abstractNumId w:val="15"/>
+  </w:num>
+  <w:num w:numId="9" w16cid:durableId="1229266003">
     <w:abstractNumId w:val="8"/>
   </w:num>
-  <w:num w:numId="3" w16cid:durableId="310716715">
-    <w:abstractNumId w:val="7"/>
+  <w:num w:numId="10" w16cid:durableId="742029984">
+    <w:abstractNumId w:val="13"/>
   </w:num>
-  <w:num w:numId="4" w16cid:durableId="1786464457">
-    <w:abstractNumId w:val="1"/>
+  <w:num w:numId="11" w16cid:durableId="1595092631">
+    <w:abstractNumId w:val="5"/>
   </w:num>
-  <w:num w:numId="5" w16cid:durableId="1211114073">
+  <w:num w:numId="12" w16cid:durableId="744304397">
+    <w:abstractNumId w:val="0"/>
+  </w:num>
+  <w:num w:numId="13" w16cid:durableId="1702511818">
+    <w:abstractNumId w:val="9"/>
+  </w:num>
+  <w:num w:numId="14" w16cid:durableId="167526228">
+    <w:abstractNumId w:val="10"/>
+  </w:num>
+  <w:num w:numId="15" w16cid:durableId="1821994609">
+    <w:abstractNumId w:val="2"/>
+  </w:num>
+  <w:num w:numId="16" w16cid:durableId="578905078">
     <w:abstractNumId w:val="4"/>
   </w:num>
-  <w:num w:numId="6" w16cid:durableId="1599631476">
-    <w:abstractNumId w:val="10"/>
-  </w:num>
-  <w:num w:numId="7" w16cid:durableId="2024476966">
-    <w:abstractNumId w:val="9"/>
-  </w:num>
-  <w:num w:numId="8" w16cid:durableId="374701637">
-    <w:abstractNumId w:val="2"/>
-  </w:num>
-  <w:num w:numId="9" w16cid:durableId="914439972">
-    <w:abstractNumId w:val="14"/>
-  </w:num>
-  <w:num w:numId="10" w16cid:durableId="260309028">
-    <w:abstractNumId w:val="5"/>
-  </w:num>
-  <w:num w:numId="11" w16cid:durableId="282352344">
+  <w:num w:numId="17" w16cid:durableId="1360083604">
     <w:abstractNumId w:val="3"/>
-  </w:num>
-  <w:num w:numId="12" w16cid:durableId="771097890">
-    <w:abstractNumId w:val="15"/>
-  </w:num>
-  <w:num w:numId="13" w16cid:durableId="1294561806">
-    <w:abstractNumId w:val="0"/>
-  </w:num>
-  <w:num w:numId="14" w16cid:durableId="651101976">
-    <w:abstractNumId w:val="13"/>
-  </w:num>
-  <w:num w:numId="15" w16cid:durableId="168252432">
-    <w:abstractNumId w:val="11"/>
-  </w:num>
-  <w:num w:numId="16" w16cid:durableId="1396392473">
-    <w:abstractNumId w:val="6"/>
-  </w:num>
-  <w:num w:numId="17" w16cid:durableId="616258697">
-    <w:abstractNumId w:val="16"/>
   </w:num>
 </w:numbering>
 </file>

</xml_diff>

<commit_message>
Departures theme (13 Oct): attendee deck, handouts, follow-along guide and site, automation republished
The AVD session's theme changes from the Norse realms to air travel (three terminals: A = AVD on Azure, B = AVD on Azure Local, C = AVD Hybrid); content unchanged.
- Deck regenerated (36 slides, attendee version without notes); Route Map slides; slide 3 "Home base: Virginia, USA"
- Handouts: Realm_Comparison renamed Platform_Comparison (PDF, Word, Markdown); Identity Three Paths diagram relabelled; all handouts and the follow-along guide re-rendered as PDF and Word
- Follow-along site: departures-board header stripe; content regenerated
- Automation from the private source: neutral example host-pool names and demo users, neutral test fixtures, README wording, Set-AvdHostPoolFriendlyName.ps1
- Gates: Test-PublicTree clean (290 files), Test-ReadmeMatchesTree clean, AttendeeDocuments and PagesSite tests 28/28
</commit_message>
<xml_diff>
--- a/handouts/Deployment_Checklist.docx
+++ b/handouts/Deployment_Checklist.docx
@@ -3472,9 +3472,9 @@
 <file path=word/numbering.xml><?xml version="1.0" encoding="utf-8"?>
 <w:numbering xmlns:wpc="http://schemas.microsoft.com/office/word/2010/wordprocessingCanvas" xmlns:cx="http://schemas.microsoft.com/office/drawing/2014/chartex" xmlns:cx1="http://schemas.microsoft.com/office/drawing/2015/9/8/chartex" xmlns:cx2="http://schemas.microsoft.com/office/drawing/2015/10/21/chartex" xmlns:cx3="http://schemas.microsoft.com/office/drawing/2016/5/9/chartex" xmlns:cx4="http://schemas.microsoft.com/office/drawing/2016/5/10/chartex" xmlns:cx5="http://schemas.microsoft.com/office/drawing/2016/5/11/chartex" xmlns:cx6="http://schemas.microsoft.com/office/drawing/2016/5/12/chartex" xmlns:cx7="http://schemas.microsoft.com/office/drawing/2016/5/13/chartex" xmlns:cx8="http://schemas.microsoft.com/office/drawing/2016/5/14/chartex" xmlns:mc="http://schemas.openxmlformats.org/markup-compatibility/2006" xmlns:aink="http://schemas.microsoft.com/office/drawing/2016/ink" xmlns:am3d="http://schemas.microsoft.com/office/drawing/2017/model3d" xmlns:o="urn:schemas-microsoft-com:office:office" xmlns:oel="http://schemas.microsoft.com/office/2019/extlst" xmlns:r="http://schemas.openxmlformats.org/officeDocument/2006/relationships" xmlns:m="http://schemas.openxmlformats.org/officeDocument/2006/math" xmlns:v="urn:schemas-microsoft-com:vml" xmlns:wp14="http://schemas.microsoft.com/office/word/2010/wordprocessingDrawing" xmlns:wp="http://schemas.openxmlformats.org/drawingml/2006/wordprocessingDrawing" xmlns:w10="urn:schemas-microsoft-com:office:word" xmlns:w="http://schemas.openxmlformats.org/wordprocessingml/2006/main" xmlns:w14="http://schemas.microsoft.com/office/word/2010/wordml" xmlns:w15="http://schemas.microsoft.com/office/word/2012/wordml" xmlns:w16cex="http://schemas.microsoft.com/office/word/2018/wordml/cex" xmlns:w16cid="http://schemas.microsoft.com/office/word/2016/wordml/cid" xmlns:w16="http://schemas.microsoft.com/office/word/2018/wordml" xmlns:w16du="http://schemas.microsoft.com/office/word/2023/wordml/word16du" xmlns:w16sdtdh="http://schemas.microsoft.com/office/word/2020/wordml/sdtdatahash" xmlns:w16sdtfl="http://schemas.microsoft.com/office/word/2024/wordml/sdtformatlock" xmlns:w16se="http://schemas.microsoft.com/office/word/2015/wordml/symex" xmlns:wpg="http://schemas.microsoft.com/office/word/2010/wordprocessingGroup" xmlns:wpi="http://schemas.microsoft.com/office/word/2010/wordprocessingInk" xmlns:wne="http://schemas.microsoft.com/office/word/2006/wordml" xmlns:wps="http://schemas.microsoft.com/office/word/2010/wordprocessingShape" mc:Ignorable="w14 w15 w16se w16cid w16 w16cex w16sdtdh w16sdtfl w16du wp14">
   <w:abstractNum w:abstractNumId="0" w15:restartNumberingAfterBreak="0">
-    <w:nsid w:val="039179D7"/>
+    <w:nsid w:val="03E75E5E"/>
     <w:multiLevelType w:val="multilevel"/>
-    <w:tmpl w:val="1A3E3CF2"/>
+    <w:tmpl w:val="172C61A2"/>
     <w:lvl w:ilvl="0">
       <w:start w:val="1"/>
       <w:numFmt w:val="bullet"/>
@@ -3621,9 +3621,9 @@
     </w:lvl>
   </w:abstractNum>
   <w:abstractNum w:abstractNumId="1" w15:restartNumberingAfterBreak="0">
-    <w:nsid w:val="06C1535D"/>
+    <w:nsid w:val="03EB0D97"/>
     <w:multiLevelType w:val="multilevel"/>
-    <w:tmpl w:val="CA4C6F80"/>
+    <w:tmpl w:val="FE4EA248"/>
     <w:lvl w:ilvl="0">
       <w:start w:val="1"/>
       <w:numFmt w:val="bullet"/>
@@ -3770,9 +3770,9 @@
     </w:lvl>
   </w:abstractNum>
   <w:abstractNum w:abstractNumId="2" w15:restartNumberingAfterBreak="0">
-    <w:nsid w:val="2884795E"/>
+    <w:nsid w:val="0A6D1FAD"/>
     <w:multiLevelType w:val="multilevel"/>
-    <w:tmpl w:val="BA5E239E"/>
+    <w:tmpl w:val="D230F942"/>
     <w:lvl w:ilvl="0">
       <w:start w:val="1"/>
       <w:numFmt w:val="bullet"/>
@@ -3919,9 +3919,9 @@
     </w:lvl>
   </w:abstractNum>
   <w:abstractNum w:abstractNumId="3" w15:restartNumberingAfterBreak="0">
-    <w:nsid w:val="2DA30C7C"/>
+    <w:nsid w:val="0E2560F0"/>
     <w:multiLevelType w:val="multilevel"/>
-    <w:tmpl w:val="5C78D0B0"/>
+    <w:tmpl w:val="58A07BBE"/>
     <w:lvl w:ilvl="0">
       <w:start w:val="1"/>
       <w:numFmt w:val="bullet"/>
@@ -4068,9 +4068,9 @@
     </w:lvl>
   </w:abstractNum>
   <w:abstractNum w:abstractNumId="4" w15:restartNumberingAfterBreak="0">
-    <w:nsid w:val="2FD53B7B"/>
+    <w:nsid w:val="180665D4"/>
     <w:multiLevelType w:val="multilevel"/>
-    <w:tmpl w:val="5C708DB8"/>
+    <w:tmpl w:val="5FFCB8B4"/>
     <w:lvl w:ilvl="0">
       <w:start w:val="1"/>
       <w:numFmt w:val="bullet"/>
@@ -4217,9 +4217,9 @@
     </w:lvl>
   </w:abstractNum>
   <w:abstractNum w:abstractNumId="5" w15:restartNumberingAfterBreak="0">
-    <w:nsid w:val="30D10953"/>
+    <w:nsid w:val="2C406162"/>
     <w:multiLevelType w:val="multilevel"/>
-    <w:tmpl w:val="EF541B54"/>
+    <w:tmpl w:val="7EF4C714"/>
     <w:lvl w:ilvl="0">
       <w:start w:val="1"/>
       <w:numFmt w:val="bullet"/>
@@ -4366,9 +4366,9 @@
     </w:lvl>
   </w:abstractNum>
   <w:abstractNum w:abstractNumId="6" w15:restartNumberingAfterBreak="0">
-    <w:nsid w:val="3F112543"/>
+    <w:nsid w:val="2C9A4F63"/>
     <w:multiLevelType w:val="multilevel"/>
-    <w:tmpl w:val="807CA0C8"/>
+    <w:tmpl w:val="B4362428"/>
     <w:lvl w:ilvl="0">
       <w:start w:val="1"/>
       <w:numFmt w:val="bullet"/>
@@ -4515,9 +4515,9 @@
     </w:lvl>
   </w:abstractNum>
   <w:abstractNum w:abstractNumId="7" w15:restartNumberingAfterBreak="0">
-    <w:nsid w:val="42E050D2"/>
+    <w:nsid w:val="2FA15D9A"/>
     <w:multiLevelType w:val="multilevel"/>
-    <w:tmpl w:val="B888B858"/>
+    <w:tmpl w:val="7480B440"/>
     <w:lvl w:ilvl="0">
       <w:start w:val="1"/>
       <w:numFmt w:val="bullet"/>
@@ -4664,9 +4664,9 @@
     </w:lvl>
   </w:abstractNum>
   <w:abstractNum w:abstractNumId="8" w15:restartNumberingAfterBreak="0">
-    <w:nsid w:val="43322774"/>
+    <w:nsid w:val="3A2B3F14"/>
     <w:multiLevelType w:val="multilevel"/>
-    <w:tmpl w:val="929AB992"/>
+    <w:tmpl w:val="660067CE"/>
     <w:lvl w:ilvl="0">
       <w:start w:val="1"/>
       <w:numFmt w:val="bullet"/>
@@ -4813,9 +4813,9 @@
     </w:lvl>
   </w:abstractNum>
   <w:abstractNum w:abstractNumId="9" w15:restartNumberingAfterBreak="0">
-    <w:nsid w:val="440D6471"/>
+    <w:nsid w:val="3A4F2902"/>
     <w:multiLevelType w:val="multilevel"/>
-    <w:tmpl w:val="195C65BE"/>
+    <w:tmpl w:val="D0F00FA6"/>
     <w:lvl w:ilvl="0">
       <w:start w:val="1"/>
       <w:numFmt w:val="bullet"/>
@@ -4962,9 +4962,9 @@
     </w:lvl>
   </w:abstractNum>
   <w:abstractNum w:abstractNumId="10" w15:restartNumberingAfterBreak="0">
-    <w:nsid w:val="46474FAF"/>
+    <w:nsid w:val="4EA43070"/>
     <w:multiLevelType w:val="multilevel"/>
-    <w:tmpl w:val="6CD83888"/>
+    <w:tmpl w:val="E4F8AC68"/>
     <w:lvl w:ilvl="0">
       <w:start w:val="1"/>
       <w:numFmt w:val="bullet"/>
@@ -5111,9 +5111,9 @@
     </w:lvl>
   </w:abstractNum>
   <w:abstractNum w:abstractNumId="11" w15:restartNumberingAfterBreak="0">
-    <w:nsid w:val="531B0812"/>
+    <w:nsid w:val="56F07920"/>
     <w:multiLevelType w:val="multilevel"/>
-    <w:tmpl w:val="B5D8CAA2"/>
+    <w:tmpl w:val="2C4CD7FE"/>
     <w:lvl w:ilvl="0">
       <w:start w:val="1"/>
       <w:numFmt w:val="bullet"/>
@@ -5260,9 +5260,9 @@
     </w:lvl>
   </w:abstractNum>
   <w:abstractNum w:abstractNumId="12" w15:restartNumberingAfterBreak="0">
-    <w:nsid w:val="58770E20"/>
+    <w:nsid w:val="5B2C634A"/>
     <w:multiLevelType w:val="multilevel"/>
-    <w:tmpl w:val="420C5570"/>
+    <w:tmpl w:val="BFC21E16"/>
     <w:lvl w:ilvl="0">
       <w:start w:val="1"/>
       <w:numFmt w:val="bullet"/>
@@ -5409,9 +5409,9 @@
     </w:lvl>
   </w:abstractNum>
   <w:abstractNum w:abstractNumId="13" w15:restartNumberingAfterBreak="0">
-    <w:nsid w:val="5893410A"/>
+    <w:nsid w:val="60252B76"/>
     <w:multiLevelType w:val="multilevel"/>
-    <w:tmpl w:val="D4EACD44"/>
+    <w:tmpl w:val="0EBCA274"/>
     <w:lvl w:ilvl="0">
       <w:start w:val="1"/>
       <w:numFmt w:val="bullet"/>
@@ -5558,9 +5558,9 @@
     </w:lvl>
   </w:abstractNum>
   <w:abstractNum w:abstractNumId="14" w15:restartNumberingAfterBreak="0">
-    <w:nsid w:val="6193169F"/>
+    <w:nsid w:val="62C14790"/>
     <w:multiLevelType w:val="multilevel"/>
-    <w:tmpl w:val="284AE71E"/>
+    <w:tmpl w:val="3D6CB05C"/>
     <w:lvl w:ilvl="0">
       <w:start w:val="1"/>
       <w:numFmt w:val="bullet"/>
@@ -5707,9 +5707,9 @@
     </w:lvl>
   </w:abstractNum>
   <w:abstractNum w:abstractNumId="15" w15:restartNumberingAfterBreak="0">
-    <w:nsid w:val="625C3F10"/>
+    <w:nsid w:val="7AA90582"/>
     <w:multiLevelType w:val="multilevel"/>
-    <w:tmpl w:val="ED881E32"/>
+    <w:tmpl w:val="D57444E2"/>
     <w:lvl w:ilvl="0">
       <w:start w:val="1"/>
       <w:numFmt w:val="bullet"/>
@@ -5856,9 +5856,9 @@
     </w:lvl>
   </w:abstractNum>
   <w:abstractNum w:abstractNumId="16" w15:restartNumberingAfterBreak="0">
-    <w:nsid w:val="76A61C4A"/>
+    <w:nsid w:val="7C244688"/>
     <w:multiLevelType w:val="multilevel"/>
-    <w:tmpl w:val="133087F6"/>
+    <w:tmpl w:val="43A45B76"/>
     <w:lvl w:ilvl="0">
       <w:start w:val="1"/>
       <w:numFmt w:val="bullet"/>
@@ -6004,56 +6004,56 @@
       </w:rPr>
     </w:lvl>
   </w:abstractNum>
-  <w:num w:numId="1" w16cid:durableId="924147049">
+  <w:num w:numId="1" w16cid:durableId="1050223557">
+    <w:abstractNumId w:val="6"/>
+  </w:num>
+  <w:num w:numId="2" w16cid:durableId="560676558">
+    <w:abstractNumId w:val="14"/>
+  </w:num>
+  <w:num w:numId="3" w16cid:durableId="984286075">
+    <w:abstractNumId w:val="4"/>
+  </w:num>
+  <w:num w:numId="4" w16cid:durableId="1866021754">
+    <w:abstractNumId w:val="5"/>
+  </w:num>
+  <w:num w:numId="5" w16cid:durableId="83694264">
+    <w:abstractNumId w:val="15"/>
+  </w:num>
+  <w:num w:numId="6" w16cid:durableId="1462381473">
+    <w:abstractNumId w:val="13"/>
+  </w:num>
+  <w:num w:numId="7" w16cid:durableId="440301076">
+    <w:abstractNumId w:val="1"/>
+  </w:num>
+  <w:num w:numId="8" w16cid:durableId="1831095537">
+    <w:abstractNumId w:val="9"/>
+  </w:num>
+  <w:num w:numId="9" w16cid:durableId="1879514071">
+    <w:abstractNumId w:val="2"/>
+  </w:num>
+  <w:num w:numId="10" w16cid:durableId="1394963136">
+    <w:abstractNumId w:val="7"/>
+  </w:num>
+  <w:num w:numId="11" w16cid:durableId="147744546">
+    <w:abstractNumId w:val="0"/>
+  </w:num>
+  <w:num w:numId="12" w16cid:durableId="1234703987">
+    <w:abstractNumId w:val="12"/>
+  </w:num>
+  <w:num w:numId="13" w16cid:durableId="709189952">
     <w:abstractNumId w:val="16"/>
   </w:num>
-  <w:num w:numId="2" w16cid:durableId="357126352">
-    <w:abstractNumId w:val="12"/>
+  <w:num w:numId="14" w16cid:durableId="1504974510">
+    <w:abstractNumId w:val="3"/>
   </w:num>
-  <w:num w:numId="3" w16cid:durableId="250898049">
-    <w:abstractNumId w:val="1"/>
-  </w:num>
-  <w:num w:numId="4" w16cid:durableId="1353797635">
-    <w:abstractNumId w:val="7"/>
-  </w:num>
-  <w:num w:numId="5" w16cid:durableId="457839182">
+  <w:num w:numId="15" w16cid:durableId="1909614296">
     <w:abstractNumId w:val="11"/>
   </w:num>
-  <w:num w:numId="6" w16cid:durableId="1926528823">
-    <w:abstractNumId w:val="14"/>
-  </w:num>
-  <w:num w:numId="7" w16cid:durableId="1302688921">
-    <w:abstractNumId w:val="6"/>
-  </w:num>
-  <w:num w:numId="8" w16cid:durableId="1731031829">
-    <w:abstractNumId w:val="15"/>
-  </w:num>
-  <w:num w:numId="9" w16cid:durableId="1229266003">
+  <w:num w:numId="16" w16cid:durableId="1527525077">
     <w:abstractNumId w:val="8"/>
   </w:num>
-  <w:num w:numId="10" w16cid:durableId="742029984">
-    <w:abstractNumId w:val="13"/>
-  </w:num>
-  <w:num w:numId="11" w16cid:durableId="1595092631">
-    <w:abstractNumId w:val="5"/>
-  </w:num>
-  <w:num w:numId="12" w16cid:durableId="744304397">
-    <w:abstractNumId w:val="0"/>
-  </w:num>
-  <w:num w:numId="13" w16cid:durableId="1702511818">
-    <w:abstractNumId w:val="9"/>
-  </w:num>
-  <w:num w:numId="14" w16cid:durableId="167526228">
+  <w:num w:numId="17" w16cid:durableId="1310551569">
     <w:abstractNumId w:val="10"/>
-  </w:num>
-  <w:num w:numId="15" w16cid:durableId="1821994609">
-    <w:abstractNumId w:val="2"/>
-  </w:num>
-  <w:num w:numId="16" w16cid:durableId="578905078">
-    <w:abstractNumId w:val="4"/>
-  </w:num>
-  <w:num w:numId="17" w16cid:durableId="1360083604">
-    <w:abstractNumId w:val="3"/>
   </w:num>
 </w:numbering>
 </file>

</xml_diff>

<commit_message>
handouts and follow-along: Hybrid platform rules (any hypervisor or headless server, not laptops; Windows Server 2016 to 2025; Shortpath not documented, test it), feedback section; PDF and Word copies rebuilt
Co-Authored-By: Claude Opus 5.5 <noreply@anthropic.com>
</commit_message>
<xml_diff>
--- a/handouts/Deployment_Checklist.docx
+++ b/handouts/Deployment_Checklist.docx
@@ -1428,7 +1428,6 @@
           <w:rFonts w:ascii="Segoe UI" w:eastAsia="Times New Roman" w:hAnsi="Segoe UI" w:cs="Segoe UI"/>
           <w:lang w:val="en"/>
         </w:rPr>
-        <w:lastRenderedPageBreak/>
         <w:t>Session hosts on Azure Local</w:t>
       </w:r>
     </w:p>
@@ -1763,7 +1762,59 @@
           <w:szCs w:val="21"/>
           <w:lang w:val="en"/>
         </w:rPr>
+        <w:t>Each session host is a VM on your hypervisor or a headless physical server, not a user's laptop or personal PC.</w:t>
+      </w:r>
+    </w:p>
+    <w:p>
+      <w:pPr>
+        <w:pStyle w:val="task-list-item"/>
+        <w:numPr>
+          <w:ilvl w:val="0"/>
+          <w:numId w:val="9"/>
+        </w:numPr>
+        <w:rPr>
+          <w:rFonts w:ascii="Segoe UI" w:eastAsia="Times New Roman" w:hAnsi="Segoe UI" w:cs="Segoe UI"/>
+          <w:color w:val="1B2430"/>
+          <w:sz w:val="21"/>
+          <w:szCs w:val="21"/>
+          <w:lang w:val="en"/>
+        </w:rPr>
+      </w:pPr>
+      <w:r>
+        <w:rPr>
+          <w:rFonts w:ascii="Segoe UI" w:eastAsia="Times New Roman" w:hAnsi="Segoe UI" w:cs="Segoe UI"/>
+          <w:color w:val="1B2430"/>
+          <w:sz w:val="21"/>
+          <w:szCs w:val="21"/>
+          <w:lang w:val="en"/>
+        </w:rPr>
         <w:t>You can deploy and power-manage the VMs with your hypervisor tools.</w:t>
+      </w:r>
+    </w:p>
+    <w:p>
+      <w:pPr>
+        <w:pStyle w:val="task-list-item"/>
+        <w:numPr>
+          <w:ilvl w:val="0"/>
+          <w:numId w:val="9"/>
+        </w:numPr>
+        <w:rPr>
+          <w:rFonts w:ascii="Segoe UI" w:eastAsia="Times New Roman" w:hAnsi="Segoe UI" w:cs="Segoe UI"/>
+          <w:color w:val="1B2430"/>
+          <w:sz w:val="21"/>
+          <w:szCs w:val="21"/>
+          <w:lang w:val="en"/>
+        </w:rPr>
+      </w:pPr>
+      <w:r>
+        <w:rPr>
+          <w:rFonts w:ascii="Segoe UI" w:eastAsia="Times New Roman" w:hAnsi="Segoe UI" w:cs="Segoe UI"/>
+          <w:color w:val="1B2430"/>
+          <w:sz w:val="21"/>
+          <w:szCs w:val="21"/>
+          <w:lang w:val="en"/>
+        </w:rPr>
+        <w:t>If on-site users should use RDP Shortpath, you have tested it: the AVD Hybrid documentation does not cover it.</w:t>
       </w:r>
     </w:p>
     <w:p>
@@ -3472,9 +3523,9 @@
 <file path=word/numbering.xml><?xml version="1.0" encoding="utf-8"?>
 <w:numbering xmlns:wpc="http://schemas.microsoft.com/office/word/2010/wordprocessingCanvas" xmlns:cx="http://schemas.microsoft.com/office/drawing/2014/chartex" xmlns:cx1="http://schemas.microsoft.com/office/drawing/2015/9/8/chartex" xmlns:cx2="http://schemas.microsoft.com/office/drawing/2015/10/21/chartex" xmlns:cx3="http://schemas.microsoft.com/office/drawing/2016/5/9/chartex" xmlns:cx4="http://schemas.microsoft.com/office/drawing/2016/5/10/chartex" xmlns:cx5="http://schemas.microsoft.com/office/drawing/2016/5/11/chartex" xmlns:cx6="http://schemas.microsoft.com/office/drawing/2016/5/12/chartex" xmlns:cx7="http://schemas.microsoft.com/office/drawing/2016/5/13/chartex" xmlns:cx8="http://schemas.microsoft.com/office/drawing/2016/5/14/chartex" xmlns:mc="http://schemas.openxmlformats.org/markup-compatibility/2006" xmlns:aink="http://schemas.microsoft.com/office/drawing/2016/ink" xmlns:am3d="http://schemas.microsoft.com/office/drawing/2017/model3d" xmlns:o="urn:schemas-microsoft-com:office:office" xmlns:oel="http://schemas.microsoft.com/office/2019/extlst" xmlns:r="http://schemas.openxmlformats.org/officeDocument/2006/relationships" xmlns:m="http://schemas.openxmlformats.org/officeDocument/2006/math" xmlns:v="urn:schemas-microsoft-com:vml" xmlns:wp14="http://schemas.microsoft.com/office/word/2010/wordprocessingDrawing" xmlns:wp="http://schemas.openxmlformats.org/drawingml/2006/wordprocessingDrawing" xmlns:w10="urn:schemas-microsoft-com:office:word" xmlns:w="http://schemas.openxmlformats.org/wordprocessingml/2006/main" xmlns:w14="http://schemas.microsoft.com/office/word/2010/wordml" xmlns:w15="http://schemas.microsoft.com/office/word/2012/wordml" xmlns:w16cex="http://schemas.microsoft.com/office/word/2018/wordml/cex" xmlns:w16cid="http://schemas.microsoft.com/office/word/2016/wordml/cid" xmlns:w16="http://schemas.microsoft.com/office/word/2018/wordml" xmlns:w16du="http://schemas.microsoft.com/office/word/2023/wordml/word16du" xmlns:w16sdtdh="http://schemas.microsoft.com/office/word/2020/wordml/sdtdatahash" xmlns:w16sdtfl="http://schemas.microsoft.com/office/word/2024/wordml/sdtformatlock" xmlns:w16se="http://schemas.microsoft.com/office/word/2015/wordml/symex" xmlns:wpg="http://schemas.microsoft.com/office/word/2010/wordprocessingGroup" xmlns:wpi="http://schemas.microsoft.com/office/word/2010/wordprocessingInk" xmlns:wne="http://schemas.microsoft.com/office/word/2006/wordml" xmlns:wps="http://schemas.microsoft.com/office/word/2010/wordprocessingShape" mc:Ignorable="w14 w15 w16se w16cid w16 w16cex w16sdtdh w16sdtfl w16du wp14">
   <w:abstractNum w:abstractNumId="0" w15:restartNumberingAfterBreak="0">
-    <w:nsid w:val="03E75E5E"/>
+    <w:nsid w:val="082407C1"/>
     <w:multiLevelType w:val="multilevel"/>
-    <w:tmpl w:val="172C61A2"/>
+    <w:tmpl w:val="70D64CE4"/>
     <w:lvl w:ilvl="0">
       <w:start w:val="1"/>
       <w:numFmt w:val="bullet"/>
@@ -3621,9 +3672,9 @@
     </w:lvl>
   </w:abstractNum>
   <w:abstractNum w:abstractNumId="1" w15:restartNumberingAfterBreak="0">
-    <w:nsid w:val="03EB0D97"/>
+    <w:nsid w:val="13217D5E"/>
     <w:multiLevelType w:val="multilevel"/>
-    <w:tmpl w:val="FE4EA248"/>
+    <w:tmpl w:val="B96C12AC"/>
     <w:lvl w:ilvl="0">
       <w:start w:val="1"/>
       <w:numFmt w:val="bullet"/>
@@ -3770,9 +3821,9 @@
     </w:lvl>
   </w:abstractNum>
   <w:abstractNum w:abstractNumId="2" w15:restartNumberingAfterBreak="0">
-    <w:nsid w:val="0A6D1FAD"/>
+    <w:nsid w:val="1BE4378C"/>
     <w:multiLevelType w:val="multilevel"/>
-    <w:tmpl w:val="D230F942"/>
+    <w:tmpl w:val="8C621890"/>
     <w:lvl w:ilvl="0">
       <w:start w:val="1"/>
       <w:numFmt w:val="bullet"/>
@@ -3919,9 +3970,9 @@
     </w:lvl>
   </w:abstractNum>
   <w:abstractNum w:abstractNumId="3" w15:restartNumberingAfterBreak="0">
-    <w:nsid w:val="0E2560F0"/>
+    <w:nsid w:val="27121A22"/>
     <w:multiLevelType w:val="multilevel"/>
-    <w:tmpl w:val="58A07BBE"/>
+    <w:tmpl w:val="A5FC292A"/>
     <w:lvl w:ilvl="0">
       <w:start w:val="1"/>
       <w:numFmt w:val="bullet"/>
@@ -4068,9 +4119,9 @@
     </w:lvl>
   </w:abstractNum>
   <w:abstractNum w:abstractNumId="4" w15:restartNumberingAfterBreak="0">
-    <w:nsid w:val="180665D4"/>
+    <w:nsid w:val="292E0F98"/>
     <w:multiLevelType w:val="multilevel"/>
-    <w:tmpl w:val="5FFCB8B4"/>
+    <w:tmpl w:val="B9544416"/>
     <w:lvl w:ilvl="0">
       <w:start w:val="1"/>
       <w:numFmt w:val="bullet"/>
@@ -4217,9 +4268,9 @@
     </w:lvl>
   </w:abstractNum>
   <w:abstractNum w:abstractNumId="5" w15:restartNumberingAfterBreak="0">
-    <w:nsid w:val="2C406162"/>
+    <w:nsid w:val="30125B31"/>
     <w:multiLevelType w:val="multilevel"/>
-    <w:tmpl w:val="7EF4C714"/>
+    <w:tmpl w:val="51721078"/>
     <w:lvl w:ilvl="0">
       <w:start w:val="1"/>
       <w:numFmt w:val="bullet"/>
@@ -4366,9 +4417,9 @@
     </w:lvl>
   </w:abstractNum>
   <w:abstractNum w:abstractNumId="6" w15:restartNumberingAfterBreak="0">
-    <w:nsid w:val="2C9A4F63"/>
+    <w:nsid w:val="3CDC77F0"/>
     <w:multiLevelType w:val="multilevel"/>
-    <w:tmpl w:val="B4362428"/>
+    <w:tmpl w:val="F3768430"/>
     <w:lvl w:ilvl="0">
       <w:start w:val="1"/>
       <w:numFmt w:val="bullet"/>
@@ -4515,9 +4566,9 @@
     </w:lvl>
   </w:abstractNum>
   <w:abstractNum w:abstractNumId="7" w15:restartNumberingAfterBreak="0">
-    <w:nsid w:val="2FA15D9A"/>
+    <w:nsid w:val="40A95F29"/>
     <w:multiLevelType w:val="multilevel"/>
-    <w:tmpl w:val="7480B440"/>
+    <w:tmpl w:val="FFA2A52C"/>
     <w:lvl w:ilvl="0">
       <w:start w:val="1"/>
       <w:numFmt w:val="bullet"/>
@@ -4664,9 +4715,9 @@
     </w:lvl>
   </w:abstractNum>
   <w:abstractNum w:abstractNumId="8" w15:restartNumberingAfterBreak="0">
-    <w:nsid w:val="3A2B3F14"/>
+    <w:nsid w:val="43A547CE"/>
     <w:multiLevelType w:val="multilevel"/>
-    <w:tmpl w:val="660067CE"/>
+    <w:tmpl w:val="D2D258E4"/>
     <w:lvl w:ilvl="0">
       <w:start w:val="1"/>
       <w:numFmt w:val="bullet"/>
@@ -4813,9 +4864,9 @@
     </w:lvl>
   </w:abstractNum>
   <w:abstractNum w:abstractNumId="9" w15:restartNumberingAfterBreak="0">
-    <w:nsid w:val="3A4F2902"/>
+    <w:nsid w:val="52622D7C"/>
     <w:multiLevelType w:val="multilevel"/>
-    <w:tmpl w:val="D0F00FA6"/>
+    <w:tmpl w:val="69EE6E0A"/>
     <w:lvl w:ilvl="0">
       <w:start w:val="1"/>
       <w:numFmt w:val="bullet"/>
@@ -4962,9 +5013,9 @@
     </w:lvl>
   </w:abstractNum>
   <w:abstractNum w:abstractNumId="10" w15:restartNumberingAfterBreak="0">
-    <w:nsid w:val="4EA43070"/>
+    <w:nsid w:val="55847E52"/>
     <w:multiLevelType w:val="multilevel"/>
-    <w:tmpl w:val="E4F8AC68"/>
+    <w:tmpl w:val="EDEE5D94"/>
     <w:lvl w:ilvl="0">
       <w:start w:val="1"/>
       <w:numFmt w:val="bullet"/>
@@ -5111,9 +5162,9 @@
     </w:lvl>
   </w:abstractNum>
   <w:abstractNum w:abstractNumId="11" w15:restartNumberingAfterBreak="0">
-    <w:nsid w:val="56F07920"/>
+    <w:nsid w:val="57983B5F"/>
     <w:multiLevelType w:val="multilevel"/>
-    <w:tmpl w:val="2C4CD7FE"/>
+    <w:tmpl w:val="C47A2EA2"/>
     <w:lvl w:ilvl="0">
       <w:start w:val="1"/>
       <w:numFmt w:val="bullet"/>
@@ -5260,9 +5311,9 @@
     </w:lvl>
   </w:abstractNum>
   <w:abstractNum w:abstractNumId="12" w15:restartNumberingAfterBreak="0">
-    <w:nsid w:val="5B2C634A"/>
+    <w:nsid w:val="60C064B6"/>
     <w:multiLevelType w:val="multilevel"/>
-    <w:tmpl w:val="BFC21E16"/>
+    <w:tmpl w:val="D068CE50"/>
     <w:lvl w:ilvl="0">
       <w:start w:val="1"/>
       <w:numFmt w:val="bullet"/>
@@ -5409,9 +5460,9 @@
     </w:lvl>
   </w:abstractNum>
   <w:abstractNum w:abstractNumId="13" w15:restartNumberingAfterBreak="0">
-    <w:nsid w:val="60252B76"/>
+    <w:nsid w:val="64491189"/>
     <w:multiLevelType w:val="multilevel"/>
-    <w:tmpl w:val="0EBCA274"/>
+    <w:tmpl w:val="E0301A5E"/>
     <w:lvl w:ilvl="0">
       <w:start w:val="1"/>
       <w:numFmt w:val="bullet"/>
@@ -5558,9 +5609,9 @@
     </w:lvl>
   </w:abstractNum>
   <w:abstractNum w:abstractNumId="14" w15:restartNumberingAfterBreak="0">
-    <w:nsid w:val="62C14790"/>
+    <w:nsid w:val="71661F14"/>
     <w:multiLevelType w:val="multilevel"/>
-    <w:tmpl w:val="3D6CB05C"/>
+    <w:tmpl w:val="0D469DAA"/>
     <w:lvl w:ilvl="0">
       <w:start w:val="1"/>
       <w:numFmt w:val="bullet"/>
@@ -5707,9 +5758,9 @@
     </w:lvl>
   </w:abstractNum>
   <w:abstractNum w:abstractNumId="15" w15:restartNumberingAfterBreak="0">
-    <w:nsid w:val="7AA90582"/>
+    <w:nsid w:val="744B3DE5"/>
     <w:multiLevelType w:val="multilevel"/>
-    <w:tmpl w:val="D57444E2"/>
+    <w:tmpl w:val="9788A410"/>
     <w:lvl w:ilvl="0">
       <w:start w:val="1"/>
       <w:numFmt w:val="bullet"/>
@@ -5856,9 +5907,9 @@
     </w:lvl>
   </w:abstractNum>
   <w:abstractNum w:abstractNumId="16" w15:restartNumberingAfterBreak="0">
-    <w:nsid w:val="7C244688"/>
+    <w:nsid w:val="76771824"/>
     <w:multiLevelType w:val="multilevel"/>
-    <w:tmpl w:val="43A45B76"/>
+    <w:tmpl w:val="65EA2A0C"/>
     <w:lvl w:ilvl="0">
       <w:start w:val="1"/>
       <w:numFmt w:val="bullet"/>
@@ -6004,56 +6055,56 @@
       </w:rPr>
     </w:lvl>
   </w:abstractNum>
-  <w:num w:numId="1" w16cid:durableId="1050223557">
+  <w:num w:numId="1" w16cid:durableId="830871815">
+    <w:abstractNumId w:val="16"/>
+  </w:num>
+  <w:num w:numId="2" w16cid:durableId="152374601">
+    <w:abstractNumId w:val="9"/>
+  </w:num>
+  <w:num w:numId="3" w16cid:durableId="679552617">
+    <w:abstractNumId w:val="11"/>
+  </w:num>
+  <w:num w:numId="4" w16cid:durableId="1438403058">
     <w:abstractNumId w:val="6"/>
   </w:num>
-  <w:num w:numId="2" w16cid:durableId="560676558">
+  <w:num w:numId="5" w16cid:durableId="635457154">
+    <w:abstractNumId w:val="0"/>
+  </w:num>
+  <w:num w:numId="6" w16cid:durableId="1134906944">
+    <w:abstractNumId w:val="4"/>
+  </w:num>
+  <w:num w:numId="7" w16cid:durableId="1254512992">
+    <w:abstractNumId w:val="3"/>
+  </w:num>
+  <w:num w:numId="8" w16cid:durableId="1215120343">
+    <w:abstractNumId w:val="1"/>
+  </w:num>
+  <w:num w:numId="9" w16cid:durableId="2121601494">
+    <w:abstractNumId w:val="7"/>
+  </w:num>
+  <w:num w:numId="10" w16cid:durableId="2127649695">
+    <w:abstractNumId w:val="13"/>
+  </w:num>
+  <w:num w:numId="11" w16cid:durableId="1308127211">
+    <w:abstractNumId w:val="2"/>
+  </w:num>
+  <w:num w:numId="12" w16cid:durableId="1225484230">
+    <w:abstractNumId w:val="12"/>
+  </w:num>
+  <w:num w:numId="13" w16cid:durableId="1207644404">
+    <w:abstractNumId w:val="10"/>
+  </w:num>
+  <w:num w:numId="14" w16cid:durableId="178277373">
+    <w:abstractNumId w:val="5"/>
+  </w:num>
+  <w:num w:numId="15" w16cid:durableId="1081105029">
+    <w:abstractNumId w:val="15"/>
+  </w:num>
+  <w:num w:numId="16" w16cid:durableId="1132500">
     <w:abstractNumId w:val="14"/>
   </w:num>
-  <w:num w:numId="3" w16cid:durableId="984286075">
-    <w:abstractNumId w:val="4"/>
-  </w:num>
-  <w:num w:numId="4" w16cid:durableId="1866021754">
-    <w:abstractNumId w:val="5"/>
-  </w:num>
-  <w:num w:numId="5" w16cid:durableId="83694264">
-    <w:abstractNumId w:val="15"/>
-  </w:num>
-  <w:num w:numId="6" w16cid:durableId="1462381473">
-    <w:abstractNumId w:val="13"/>
-  </w:num>
-  <w:num w:numId="7" w16cid:durableId="440301076">
-    <w:abstractNumId w:val="1"/>
-  </w:num>
-  <w:num w:numId="8" w16cid:durableId="1831095537">
-    <w:abstractNumId w:val="9"/>
-  </w:num>
-  <w:num w:numId="9" w16cid:durableId="1879514071">
-    <w:abstractNumId w:val="2"/>
-  </w:num>
-  <w:num w:numId="10" w16cid:durableId="1394963136">
-    <w:abstractNumId w:val="7"/>
-  </w:num>
-  <w:num w:numId="11" w16cid:durableId="147744546">
-    <w:abstractNumId w:val="0"/>
-  </w:num>
-  <w:num w:numId="12" w16cid:durableId="1234703987">
-    <w:abstractNumId w:val="12"/>
-  </w:num>
-  <w:num w:numId="13" w16cid:durableId="709189952">
-    <w:abstractNumId w:val="16"/>
-  </w:num>
-  <w:num w:numId="14" w16cid:durableId="1504974510">
-    <w:abstractNumId w:val="3"/>
-  </w:num>
-  <w:num w:numId="15" w16cid:durableId="1909614296">
-    <w:abstractNumId w:val="11"/>
-  </w:num>
-  <w:num w:numId="16" w16cid:durableId="1527525077">
+  <w:num w:numId="17" w16cid:durableId="1316060038">
     <w:abstractNumId w:val="8"/>
-  </w:num>
-  <w:num w:numId="17" w16cid:durableId="1310551569">
-    <w:abstractNumId w:val="10"/>
   </w:num>
 </w:numbering>
 </file>

</xml_diff>